<commit_message>
main solve hsds problems
</commit_message>
<xml_diff>
--- a/docx/szakdoga-12-11_2.docx
+++ b/docx/szakdoga-12-11_2.docx
@@ -9746,26 +9746,13 @@
       </w:r>
       <w:r>
         <w:lastRenderedPageBreak/>
-        <w:t xml:space="preserve">kapcsolat: bár a nagy mintanagyság miatt néhány rendkívül gyenge korreláció formálisan szignifikáns p-értéket adott, az </w:t>
-      </w:r>
-      <w:proofErr w:type="spellStart"/>
-      <w:r>
-        <w:t>effektusm</w:t>
-      </w:r>
-      <w:proofErr w:type="spellEnd"/>
-      <w:r>
-        <w:tab/>
-      </w:r>
-      <w:r>
-        <w:t xml:space="preserve">éretek minden esetben elhanyagolhatóak voltak (|r| </w:t>
-      </w:r>
-      <w:proofErr w:type="gramStart"/>
-      <w:r>
-        <w:t>&lt; 0.1</w:t>
-      </w:r>
-      <w:proofErr w:type="gramEnd"/>
-      <w:r>
-        <w:t>). Ez azt jelzi, hogy a szignifikancia a mintanagyság érzékenységéből fakad, és</w:t>
+        <w:t>kapcsolat: bár a nagy mintanagyság miatt néhány rendkívül gyenge korreláció formálisan szignifikáns p-értéket adott, az effektus</w:t>
+      </w:r>
+      <w:r>
+        <w:t xml:space="preserve"> </w:t>
+      </w:r>
+      <w:r>
+        <w:t>méretek minden esetben elhanyagolhatóak voltak (|r| &lt; 0.1). Ez azt jelzi, hogy a szignifikancia a mintanagyság érzékenységéből fakad, és</w:t>
       </w:r>
       <w:r>
         <w:rPr>

</xml_diff>